<commit_message>
added new features to the memo
</commit_message>
<xml_diff>
--- a/template.docx
+++ b/template.docx
@@ -130,6 +130,17 @@
         </w:rPr>
         <w:t>{{COVER_TEXT}}</w:t>
       </w:r>
+    </w:p>
+    <w:p>
+      <w:pPr>
+        <w:spacing w:after="160" w:line="259" w:lineRule="auto"/>
+        <w:rPr>
+          <w:rFonts w:ascii="Menlo" w:hAnsi="Menlo" w:cs="Menlo"/>
+          <w:color w:val="D8DEE9"/>
+          <w:sz w:val="18"/>
+          <w:szCs w:val="18"/>
+        </w:rPr>
+      </w:pPr>
     </w:p>
     <w:p>
       <w:pPr>

</xml_diff>